<commit_message>
primer version funcional de contratos conectados con la hoja de google
</commit_message>
<xml_diff>
--- a/public/plantillas/plantilla contrato.docx
+++ b/public/plantillas/plantilla contrato.docx
@@ -1740,6 +1740,674 @@
             </w:pPr>
             <w:r>
               <w:t>[DIRECCION_DEPENDIENTE_2]</w:t>
+            </w:r>
+          </w:p>
+        </w:tc>
+      </w:tr>
+      <w:tr w14:paraId="3D3DD">
+        <w:tc>
+          <w:tcPr>
+            <w:tcW w:w="2410" w:type="dxa"/>
+            <w:tcBorders>
+              <w:top w:val="single" w:sz="6" w:space="0" w:color="000000"/>
+              <w:left w:val="single" w:sz="6" w:space="0" w:color="000000"/>
+              <w:bottom w:val="single" w:sz="6" w:space="0" w:color="000000"/>
+              <w:right w:val="single" w:sz="6" w:space="0" w:color="000000"/>
+            </w:tcBorders>
+            <w:tcMar>
+              <w:top w:w="90" w:type="dxa"/>
+              <w:left w:w="120" w:type="dxa"/>
+              <w:bottom w:w="90" w:type="dxa"/>
+              <w:right w:w="120" w:type="dxa"/>
+            </w:tcMar>
+          </w:tcPr>
+          <w:p w14:paraId="3D3DD">
+            <w:pPr>
+              <w:pBdr>
+                <w:top w:val="nil"/>
+                <w:left w:val="nil"/>
+                <w:bottom w:val="nil"/>
+                <w:right w:val="nil"/>
+                <w:between w:val="nil"/>
+              </w:pBdr>
+              <w:spacing w:before="90" w:after="0"/>
+              <w:ind w:left="0" w:right="-846"/>
+            </w:pPr>
+            <w:r>
+              <w:t>[NOMBRE_DEPENDIENTE_3]</w:t>
+            </w:r>
+          </w:p>
+        </w:tc>
+        <w:tc>
+          <w:tcPr>
+            <w:tcW w:w="2126" w:type="dxa"/>
+            <w:tcBorders>
+              <w:top w:val="single" w:sz="6" w:space="0" w:color="000000"/>
+              <w:left w:val="single" w:sz="6" w:space="0" w:color="000000"/>
+              <w:bottom w:val="single" w:sz="6" w:space="0" w:color="000000"/>
+              <w:right w:val="single" w:sz="6" w:space="0" w:color="000000"/>
+            </w:tcBorders>
+            <w:tcMar>
+              <w:top w:w="90" w:type="dxa"/>
+              <w:left w:w="120" w:type="dxa"/>
+              <w:bottom w:w="90" w:type="dxa"/>
+              <w:right w:w="120" w:type="dxa"/>
+            </w:tcMar>
+          </w:tcPr>
+          <w:p w14:paraId="3D3DD">
+            <w:pPr>
+              <w:pBdr>
+                <w:top w:val="nil"/>
+                <w:left w:val="nil"/>
+                <w:bottom w:val="nil"/>
+                <w:right w:val="nil"/>
+                <w:between w:val="nil"/>
+              </w:pBdr>
+              <w:spacing w:before="90" w:after="0"/>
+              <w:ind w:left="0" w:right="-846"/>
+            </w:pPr>
+            <w:r>
+              <w:t>[APELLIDO_DEPENDIENTE_3]</w:t>
+            </w:r>
+          </w:p>
+        </w:tc>
+        <w:tc>
+          <w:tcPr>
+            <w:tcW w:w="851" w:type="dxa"/>
+            <w:tcBorders>
+              <w:top w:val="single" w:sz="6" w:space="0" w:color="000000"/>
+              <w:left w:val="single" w:sz="6" w:space="0" w:color="000000"/>
+              <w:bottom w:val="single" w:sz="6" w:space="0" w:color="000000"/>
+              <w:right w:val="single" w:sz="6" w:space="0" w:color="000000"/>
+            </w:tcBorders>
+            <w:tcMar>
+              <w:top w:w="90" w:type="dxa"/>
+              <w:left w:w="120" w:type="dxa"/>
+              <w:bottom w:w="90" w:type="dxa"/>
+              <w:right w:w="120" w:type="dxa"/>
+            </w:tcMar>
+          </w:tcPr>
+          <w:p w14:paraId="3D3DD">
+            <w:pPr>
+              <w:pBdr>
+                <w:top w:val="nil"/>
+                <w:left w:val="nil"/>
+                <w:bottom w:val="nil"/>
+                <w:right w:val="nil"/>
+                <w:between w:val="nil"/>
+              </w:pBdr>
+              <w:spacing w:before="90" w:after="0"/>
+              <w:ind w:left="0" w:right="-846"/>
+            </w:pPr>
+            <w:r>
+              <w:t>[EDAD_DEPENDIENTE_3]</w:t>
+            </w:r>
+          </w:p>
+        </w:tc>
+        <w:tc>
+          <w:tcPr>
+            <w:tcW w:w="2693" w:type="dxa"/>
+            <w:tcBorders>
+              <w:top w:val="single" w:sz="6" w:space="0" w:color="000000"/>
+              <w:left w:val="single" w:sz="6" w:space="0" w:color="000000"/>
+              <w:bottom w:val="single" w:sz="6" w:space="0" w:color="000000"/>
+              <w:right w:val="single" w:sz="6" w:space="0" w:color="000000"/>
+            </w:tcBorders>
+            <w:tcMar>
+              <w:top w:w="90" w:type="dxa"/>
+              <w:left w:w="120" w:type="dxa"/>
+              <w:bottom w:w="90" w:type="dxa"/>
+              <w:right w:w="120" w:type="dxa"/>
+            </w:tcMar>
+          </w:tcPr>
+          <w:p w14:paraId="3D3DD">
+            <w:pPr>
+              <w:pBdr>
+                <w:top w:val="nil"/>
+                <w:left w:val="nil"/>
+                <w:bottom w:val="nil"/>
+                <w:right w:val="nil"/>
+                <w:between w:val="nil"/>
+              </w:pBdr>
+              <w:spacing w:before="90" w:after="0"/>
+              <w:ind w:left="0" w:right="-846"/>
+            </w:pPr>
+            <w:r>
+              <w:t>[PARENTESCO_DEPENDIENTE_3]</w:t>
+            </w:r>
+          </w:p>
+        </w:tc>
+        <w:tc>
+          <w:tcPr>
+            <w:tcW w:w="2835" w:type="dxa"/>
+            <w:tcBorders>
+              <w:top w:val="single" w:sz="6" w:space="0" w:color="000000"/>
+              <w:left w:val="single" w:sz="6" w:space="0" w:color="000000"/>
+              <w:bottom w:val="single" w:sz="6" w:space="0" w:color="000000"/>
+              <w:right w:val="single" w:sz="6" w:space="0" w:color="000000"/>
+            </w:tcBorders>
+            <w:tcMar>
+              <w:top w:w="90" w:type="dxa"/>
+              <w:left w:w="120" w:type="dxa"/>
+              <w:bottom w:w="90" w:type="dxa"/>
+              <w:right w:w="120" w:type="dxa"/>
+            </w:tcMar>
+          </w:tcPr>
+          <w:p w14:paraId="3D3DD">
+            <w:pPr>
+              <w:pBdr>
+                <w:top w:val="nil"/>
+                <w:left w:val="nil"/>
+                <w:bottom w:val="nil"/>
+                <w:right w:val="nil"/>
+                <w:between w:val="nil"/>
+              </w:pBdr>
+              <w:spacing w:before="90" w:after="0"/>
+              <w:ind w:left="0" w:right="-846"/>
+            </w:pPr>
+            <w:r>
+              <w:t>[DIRECCION_DEPENDIENTE_3]</w:t>
+            </w:r>
+          </w:p>
+        </w:tc>
+      </w:tr>
+      <w:tr w14:paraId="4D4DD">
+        <w:tc>
+          <w:tcPr>
+            <w:tcW w:w="2410" w:type="dxa"/>
+            <w:tcBorders>
+              <w:top w:val="single" w:sz="6" w:space="0" w:color="000000"/>
+              <w:left w:val="single" w:sz="6" w:space="0" w:color="000000"/>
+              <w:bottom w:val="single" w:sz="6" w:space="0" w:color="000000"/>
+              <w:right w:val="single" w:sz="6" w:space="0" w:color="000000"/>
+            </w:tcBorders>
+            <w:tcMar>
+              <w:top w:w="90" w:type="dxa"/>
+              <w:left w:w="120" w:type="dxa"/>
+              <w:bottom w:w="90" w:type="dxa"/>
+              <w:right w:w="120" w:type="dxa"/>
+            </w:tcMar>
+          </w:tcPr>
+          <w:p w14:paraId="4D4DD">
+            <w:pPr>
+              <w:pBdr>
+                <w:top w:val="nil"/>
+                <w:left w:val="nil"/>
+                <w:bottom w:val="nil"/>
+                <w:right w:val="nil"/>
+                <w:between w:val="nil"/>
+              </w:pBdr>
+              <w:spacing w:before="90" w:after="0"/>
+              <w:ind w:left="0" w:right="-846"/>
+            </w:pPr>
+            <w:r>
+              <w:t>[NOMBRE_DEPENDIENTE_4]</w:t>
+            </w:r>
+          </w:p>
+        </w:tc>
+        <w:tc>
+          <w:tcPr>
+            <w:tcW w:w="2126" w:type="dxa"/>
+            <w:tcBorders>
+              <w:top w:val="single" w:sz="6" w:space="0" w:color="000000"/>
+              <w:left w:val="single" w:sz="6" w:space="0" w:color="000000"/>
+              <w:bottom w:val="single" w:sz="6" w:space="0" w:color="000000"/>
+              <w:right w:val="single" w:sz="6" w:space="0" w:color="000000"/>
+            </w:tcBorders>
+            <w:tcMar>
+              <w:top w:w="90" w:type="dxa"/>
+              <w:left w:w="120" w:type="dxa"/>
+              <w:bottom w:w="90" w:type="dxa"/>
+              <w:right w:w="120" w:type="dxa"/>
+            </w:tcMar>
+          </w:tcPr>
+          <w:p w14:paraId="4D4DD">
+            <w:pPr>
+              <w:pBdr>
+                <w:top w:val="nil"/>
+                <w:left w:val="nil"/>
+                <w:bottom w:val="nil"/>
+                <w:right w:val="nil"/>
+                <w:between w:val="nil"/>
+              </w:pBdr>
+              <w:spacing w:before="90" w:after="0"/>
+              <w:ind w:left="0" w:right="-846"/>
+            </w:pPr>
+            <w:r>
+              <w:t>[APELLIDO_DEPENDIENTE_4]</w:t>
+            </w:r>
+          </w:p>
+        </w:tc>
+        <w:tc>
+          <w:tcPr>
+            <w:tcW w:w="851" w:type="dxa"/>
+            <w:tcBorders>
+              <w:top w:val="single" w:sz="6" w:space="0" w:color="000000"/>
+              <w:left w:val="single" w:sz="6" w:space="0" w:color="000000"/>
+              <w:bottom w:val="single" w:sz="6" w:space="0" w:color="000000"/>
+              <w:right w:val="single" w:sz="6" w:space="0" w:color="000000"/>
+            </w:tcBorders>
+            <w:tcMar>
+              <w:top w:w="90" w:type="dxa"/>
+              <w:left w:w="120" w:type="dxa"/>
+              <w:bottom w:w="90" w:type="dxa"/>
+              <w:right w:w="120" w:type="dxa"/>
+            </w:tcMar>
+          </w:tcPr>
+          <w:p w14:paraId="4D4DD">
+            <w:pPr>
+              <w:pBdr>
+                <w:top w:val="nil"/>
+                <w:left w:val="nil"/>
+                <w:bottom w:val="nil"/>
+                <w:right w:val="nil"/>
+                <w:between w:val="nil"/>
+              </w:pBdr>
+              <w:spacing w:before="90" w:after="0"/>
+              <w:ind w:left="0" w:right="-846"/>
+            </w:pPr>
+            <w:r>
+              <w:t>[EDAD_DEPENDIENTE_4]</w:t>
+            </w:r>
+          </w:p>
+        </w:tc>
+        <w:tc>
+          <w:tcPr>
+            <w:tcW w:w="2693" w:type="dxa"/>
+            <w:tcBorders>
+              <w:top w:val="single" w:sz="6" w:space="0" w:color="000000"/>
+              <w:left w:val="single" w:sz="6" w:space="0" w:color="000000"/>
+              <w:bottom w:val="single" w:sz="6" w:space="0" w:color="000000"/>
+              <w:right w:val="single" w:sz="6" w:space="0" w:color="000000"/>
+            </w:tcBorders>
+            <w:tcMar>
+              <w:top w:w="90" w:type="dxa"/>
+              <w:left w:w="120" w:type="dxa"/>
+              <w:bottom w:w="90" w:type="dxa"/>
+              <w:right w:w="120" w:type="dxa"/>
+            </w:tcMar>
+          </w:tcPr>
+          <w:p w14:paraId="4D4DD">
+            <w:pPr>
+              <w:pBdr>
+                <w:top w:val="nil"/>
+                <w:left w:val="nil"/>
+                <w:bottom w:val="nil"/>
+                <w:right w:val="nil"/>
+                <w:between w:val="nil"/>
+              </w:pBdr>
+              <w:spacing w:before="90" w:after="0"/>
+              <w:ind w:left="0" w:right="-846"/>
+            </w:pPr>
+            <w:r>
+              <w:t>[PARENTESCO_DEPENDIENTE_4]</w:t>
+            </w:r>
+          </w:p>
+        </w:tc>
+        <w:tc>
+          <w:tcPr>
+            <w:tcW w:w="2835" w:type="dxa"/>
+            <w:tcBorders>
+              <w:top w:val="single" w:sz="6" w:space="0" w:color="000000"/>
+              <w:left w:val="single" w:sz="6" w:space="0" w:color="000000"/>
+              <w:bottom w:val="single" w:sz="6" w:space="0" w:color="000000"/>
+              <w:right w:val="single" w:sz="6" w:space="0" w:color="000000"/>
+            </w:tcBorders>
+            <w:tcMar>
+              <w:top w:w="90" w:type="dxa"/>
+              <w:left w:w="120" w:type="dxa"/>
+              <w:bottom w:w="90" w:type="dxa"/>
+              <w:right w:w="120" w:type="dxa"/>
+            </w:tcMar>
+          </w:tcPr>
+          <w:p w14:paraId="4D4DD">
+            <w:pPr>
+              <w:pBdr>
+                <w:top w:val="nil"/>
+                <w:left w:val="nil"/>
+                <w:bottom w:val="nil"/>
+                <w:right w:val="nil"/>
+                <w:between w:val="nil"/>
+              </w:pBdr>
+              <w:spacing w:before="90" w:after="0"/>
+              <w:ind w:left="0" w:right="-846"/>
+            </w:pPr>
+            <w:r>
+              <w:t>[DIRECCION_DEPENDIENTE_4]</w:t>
+            </w:r>
+          </w:p>
+        </w:tc>
+      </w:tr>
+      <w:tr w14:paraId="5D5DD">
+        <w:tc>
+          <w:tcPr>
+            <w:tcW w:w="2410" w:type="dxa"/>
+            <w:tcBorders>
+              <w:top w:val="single" w:sz="6" w:space="0" w:color="000000"/>
+              <w:left w:val="single" w:sz="6" w:space="0" w:color="000000"/>
+              <w:bottom w:val="single" w:sz="6" w:space="0" w:color="000000"/>
+              <w:right w:val="single" w:sz="6" w:space="0" w:color="000000"/>
+            </w:tcBorders>
+            <w:tcMar>
+              <w:top w:w="90" w:type="dxa"/>
+              <w:left w:w="120" w:type="dxa"/>
+              <w:bottom w:w="90" w:type="dxa"/>
+              <w:right w:w="120" w:type="dxa"/>
+            </w:tcMar>
+          </w:tcPr>
+          <w:p w14:paraId="5D5DD">
+            <w:pPr>
+              <w:pBdr>
+                <w:top w:val="nil"/>
+                <w:left w:val="nil"/>
+                <w:bottom w:val="nil"/>
+                <w:right w:val="nil"/>
+                <w:between w:val="nil"/>
+              </w:pBdr>
+              <w:spacing w:before="90" w:after="0"/>
+              <w:ind w:left="0" w:right="-846"/>
+            </w:pPr>
+            <w:r>
+              <w:t>[NOMBRE_DEPENDIENTE_5]</w:t>
+            </w:r>
+          </w:p>
+        </w:tc>
+        <w:tc>
+          <w:tcPr>
+            <w:tcW w:w="2126" w:type="dxa"/>
+            <w:tcBorders>
+              <w:top w:val="single" w:sz="6" w:space="0" w:color="000000"/>
+              <w:left w:val="single" w:sz="6" w:space="0" w:color="000000"/>
+              <w:bottom w:val="single" w:sz="6" w:space="0" w:color="000000"/>
+              <w:right w:val="single" w:sz="6" w:space="0" w:color="000000"/>
+            </w:tcBorders>
+            <w:tcMar>
+              <w:top w:w="90" w:type="dxa"/>
+              <w:left w:w="120" w:type="dxa"/>
+              <w:bottom w:w="90" w:type="dxa"/>
+              <w:right w:w="120" w:type="dxa"/>
+            </w:tcMar>
+          </w:tcPr>
+          <w:p w14:paraId="5D5DD">
+            <w:pPr>
+              <w:pBdr>
+                <w:top w:val="nil"/>
+                <w:left w:val="nil"/>
+                <w:bottom w:val="nil"/>
+                <w:right w:val="nil"/>
+                <w:between w:val="nil"/>
+              </w:pBdr>
+              <w:spacing w:before="90" w:after="0"/>
+              <w:ind w:left="0" w:right="-846"/>
+            </w:pPr>
+            <w:r>
+              <w:t>[APELLIDO_DEPENDIENTE_5]</w:t>
+            </w:r>
+          </w:p>
+        </w:tc>
+        <w:tc>
+          <w:tcPr>
+            <w:tcW w:w="851" w:type="dxa"/>
+            <w:tcBorders>
+              <w:top w:val="single" w:sz="6" w:space="0" w:color="000000"/>
+              <w:left w:val="single" w:sz="6" w:space="0" w:color="000000"/>
+              <w:bottom w:val="single" w:sz="6" w:space="0" w:color="000000"/>
+              <w:right w:val="single" w:sz="6" w:space="0" w:color="000000"/>
+            </w:tcBorders>
+            <w:tcMar>
+              <w:top w:w="90" w:type="dxa"/>
+              <w:left w:w="120" w:type="dxa"/>
+              <w:bottom w:w="90" w:type="dxa"/>
+              <w:right w:w="120" w:type="dxa"/>
+            </w:tcMar>
+          </w:tcPr>
+          <w:p w14:paraId="5D5DD">
+            <w:pPr>
+              <w:pBdr>
+                <w:top w:val="nil"/>
+                <w:left w:val="nil"/>
+                <w:bottom w:val="nil"/>
+                <w:right w:val="nil"/>
+                <w:between w:val="nil"/>
+              </w:pBdr>
+              <w:spacing w:before="90" w:after="0"/>
+              <w:ind w:left="0" w:right="-846"/>
+            </w:pPr>
+            <w:r>
+              <w:t>[EDAD_DEPENDIENTE_5]</w:t>
+            </w:r>
+          </w:p>
+        </w:tc>
+        <w:tc>
+          <w:tcPr>
+            <w:tcW w:w="2693" w:type="dxa"/>
+            <w:tcBorders>
+              <w:top w:val="single" w:sz="6" w:space="0" w:color="000000"/>
+              <w:left w:val="single" w:sz="6" w:space="0" w:color="000000"/>
+              <w:bottom w:val="single" w:sz="6" w:space="0" w:color="000000"/>
+              <w:right w:val="single" w:sz="6" w:space="0" w:color="000000"/>
+            </w:tcBorders>
+            <w:tcMar>
+              <w:top w:w="90" w:type="dxa"/>
+              <w:left w:w="120" w:type="dxa"/>
+              <w:bottom w:w="90" w:type="dxa"/>
+              <w:right w:w="120" w:type="dxa"/>
+            </w:tcMar>
+          </w:tcPr>
+          <w:p w14:paraId="5D5DD">
+            <w:pPr>
+              <w:pBdr>
+                <w:top w:val="nil"/>
+                <w:left w:val="nil"/>
+                <w:bottom w:val="nil"/>
+                <w:right w:val="nil"/>
+                <w:between w:val="nil"/>
+              </w:pBdr>
+              <w:spacing w:before="90" w:after="0"/>
+              <w:ind w:left="0" w:right="-846"/>
+            </w:pPr>
+            <w:r>
+              <w:t>[PARENTESCO_DEPENDIENTE_5]</w:t>
+            </w:r>
+          </w:p>
+        </w:tc>
+        <w:tc>
+          <w:tcPr>
+            <w:tcW w:w="2835" w:type="dxa"/>
+            <w:tcBorders>
+              <w:top w:val="single" w:sz="6" w:space="0" w:color="000000"/>
+              <w:left w:val="single" w:sz="6" w:space="0" w:color="000000"/>
+              <w:bottom w:val="single" w:sz="6" w:space="0" w:color="000000"/>
+              <w:right w:val="single" w:sz="6" w:space="0" w:color="000000"/>
+            </w:tcBorders>
+            <w:tcMar>
+              <w:top w:w="90" w:type="dxa"/>
+              <w:left w:w="120" w:type="dxa"/>
+              <w:bottom w:w="90" w:type="dxa"/>
+              <w:right w:w="120" w:type="dxa"/>
+            </w:tcMar>
+          </w:tcPr>
+          <w:p w14:paraId="5D5DD">
+            <w:pPr>
+              <w:pBdr>
+                <w:top w:val="nil"/>
+                <w:left w:val="nil"/>
+                <w:bottom w:val="nil"/>
+                <w:right w:val="nil"/>
+                <w:between w:val="nil"/>
+              </w:pBdr>
+              <w:spacing w:before="90" w:after="0"/>
+              <w:ind w:left="0" w:right="-846"/>
+            </w:pPr>
+            <w:r>
+              <w:t>[DIRECCION_DEPENDIENTE_5]</w:t>
+            </w:r>
+          </w:p>
+        </w:tc>
+      </w:tr>
+      <w:tr w14:paraId="6D6DD">
+        <w:tc>
+          <w:tcPr>
+            <w:tcW w:w="2410" w:type="dxa"/>
+            <w:tcBorders>
+              <w:top w:val="single" w:sz="6" w:space="0" w:color="000000"/>
+              <w:left w:val="single" w:sz="6" w:space="0" w:color="000000"/>
+              <w:bottom w:val="single" w:sz="6" w:space="0" w:color="000000"/>
+              <w:right w:val="single" w:sz="6" w:space="0" w:color="000000"/>
+            </w:tcBorders>
+            <w:tcMar>
+              <w:top w:w="90" w:type="dxa"/>
+              <w:left w:w="120" w:type="dxa"/>
+              <w:bottom w:w="90" w:type="dxa"/>
+              <w:right w:w="120" w:type="dxa"/>
+            </w:tcMar>
+          </w:tcPr>
+          <w:p w14:paraId="6D6DD">
+            <w:pPr>
+              <w:pBdr>
+                <w:top w:val="nil"/>
+                <w:left w:val="nil"/>
+                <w:bottom w:val="nil"/>
+                <w:right w:val="nil"/>
+                <w:between w:val="nil"/>
+              </w:pBdr>
+              <w:spacing w:before="90" w:after="0"/>
+              <w:ind w:left="0" w:right="-846"/>
+            </w:pPr>
+            <w:r>
+              <w:t>[NOMBRE_DEPENDIENTE_6]</w:t>
+            </w:r>
+          </w:p>
+        </w:tc>
+        <w:tc>
+          <w:tcPr>
+            <w:tcW w:w="2126" w:type="dxa"/>
+            <w:tcBorders>
+              <w:top w:val="single" w:sz="6" w:space="0" w:color="000000"/>
+              <w:left w:val="single" w:sz="6" w:space="0" w:color="000000"/>
+              <w:bottom w:val="single" w:sz="6" w:space="0" w:color="000000"/>
+              <w:right w:val="single" w:sz="6" w:space="0" w:color="000000"/>
+            </w:tcBorders>
+            <w:tcMar>
+              <w:top w:w="90" w:type="dxa"/>
+              <w:left w:w="120" w:type="dxa"/>
+              <w:bottom w:w="90" w:type="dxa"/>
+              <w:right w:w="120" w:type="dxa"/>
+            </w:tcMar>
+          </w:tcPr>
+          <w:p w14:paraId="6D6DD">
+            <w:pPr>
+              <w:pBdr>
+                <w:top w:val="nil"/>
+                <w:left w:val="nil"/>
+                <w:bottom w:val="nil"/>
+                <w:right w:val="nil"/>
+                <w:between w:val="nil"/>
+              </w:pBdr>
+              <w:spacing w:before="90" w:after="0"/>
+              <w:ind w:left="0" w:right="-846"/>
+            </w:pPr>
+            <w:r>
+              <w:t>[APELLIDO_DEPENDIENTE_6]</w:t>
+            </w:r>
+          </w:p>
+        </w:tc>
+        <w:tc>
+          <w:tcPr>
+            <w:tcW w:w="851" w:type="dxa"/>
+            <w:tcBorders>
+              <w:top w:val="single" w:sz="6" w:space="0" w:color="000000"/>
+              <w:left w:val="single" w:sz="6" w:space="0" w:color="000000"/>
+              <w:bottom w:val="single" w:sz="6" w:space="0" w:color="000000"/>
+              <w:right w:val="single" w:sz="6" w:space="0" w:color="000000"/>
+            </w:tcBorders>
+            <w:tcMar>
+              <w:top w:w="90" w:type="dxa"/>
+              <w:left w:w="120" w:type="dxa"/>
+              <w:bottom w:w="90" w:type="dxa"/>
+              <w:right w:w="120" w:type="dxa"/>
+            </w:tcMar>
+          </w:tcPr>
+          <w:p w14:paraId="6D6DD">
+            <w:pPr>
+              <w:pBdr>
+                <w:top w:val="nil"/>
+                <w:left w:val="nil"/>
+                <w:bottom w:val="nil"/>
+                <w:right w:val="nil"/>
+                <w:between w:val="nil"/>
+              </w:pBdr>
+              <w:spacing w:before="90" w:after="0"/>
+              <w:ind w:left="0" w:right="-846"/>
+            </w:pPr>
+            <w:r>
+              <w:t>[EDAD_DEPENDIENTE_6]</w:t>
+            </w:r>
+          </w:p>
+        </w:tc>
+        <w:tc>
+          <w:tcPr>
+            <w:tcW w:w="2693" w:type="dxa"/>
+            <w:tcBorders>
+              <w:top w:val="single" w:sz="6" w:space="0" w:color="000000"/>
+              <w:left w:val="single" w:sz="6" w:space="0" w:color="000000"/>
+              <w:bottom w:val="single" w:sz="6" w:space="0" w:color="000000"/>
+              <w:right w:val="single" w:sz="6" w:space="0" w:color="000000"/>
+            </w:tcBorders>
+            <w:tcMar>
+              <w:top w:w="90" w:type="dxa"/>
+              <w:left w:w="120" w:type="dxa"/>
+              <w:bottom w:w="90" w:type="dxa"/>
+              <w:right w:w="120" w:type="dxa"/>
+            </w:tcMar>
+          </w:tcPr>
+          <w:p w14:paraId="6D6DD">
+            <w:pPr>
+              <w:pBdr>
+                <w:top w:val="nil"/>
+                <w:left w:val="nil"/>
+                <w:bottom w:val="nil"/>
+                <w:right w:val="nil"/>
+                <w:between w:val="nil"/>
+              </w:pBdr>
+              <w:spacing w:before="90" w:after="0"/>
+              <w:ind w:left="0" w:right="-846"/>
+            </w:pPr>
+            <w:r>
+              <w:t>[PARENTESCO_DEPENDIENTE_6]</w:t>
+            </w:r>
+          </w:p>
+        </w:tc>
+        <w:tc>
+          <w:tcPr>
+            <w:tcW w:w="2835" w:type="dxa"/>
+            <w:tcBorders>
+              <w:top w:val="single" w:sz="6" w:space="0" w:color="000000"/>
+              <w:left w:val="single" w:sz="6" w:space="0" w:color="000000"/>
+              <w:bottom w:val="single" w:sz="6" w:space="0" w:color="000000"/>
+              <w:right w:val="single" w:sz="6" w:space="0" w:color="000000"/>
+            </w:tcBorders>
+            <w:tcMar>
+              <w:top w:w="90" w:type="dxa"/>
+              <w:left w:w="120" w:type="dxa"/>
+              <w:bottom w:w="90" w:type="dxa"/>
+              <w:right w:w="120" w:type="dxa"/>
+            </w:tcMar>
+          </w:tcPr>
+          <w:p w14:paraId="6D6DD">
+            <w:pPr>
+              <w:pBdr>
+                <w:top w:val="nil"/>
+                <w:left w:val="nil"/>
+                <w:bottom w:val="nil"/>
+                <w:right w:val="nil"/>
+                <w:between w:val="nil"/>
+              </w:pBdr>
+              <w:spacing w:before="90" w:after="0"/>
+              <w:ind w:left="0" w:right="-846"/>
+            </w:pPr>
+            <w:r>
+              <w:t>[DIRECCION_DEPENDIENTE_6]</w:t>
             </w:r>
           </w:p>
         </w:tc>

</xml_diff>